<commit_message>
change in Day 5 material
</commit_message>
<xml_diff>
--- a/Day 5/Day 5_Reference_Material.docx
+++ b/Day 5/Day 5_Reference_Material.docx
@@ -13403,7 +13403,13 @@
               <w:rPr>
                 <w:rFonts w:ascii="Times New Roman" w:hAnsi="Times New Roman" w:cs="Times New Roman"/>
               </w:rPr>
-              <w:t>subsample</w:t>
+              <w:t>S</w:t>
+            </w:r>
+            <w:r>
+              <w:rPr>
+                <w:rFonts w:ascii="Times New Roman" w:hAnsi="Times New Roman" w:cs="Times New Roman"/>
+              </w:rPr>
+              <w:t>ubsample</w:t>
             </w:r>
           </w:p>
         </w:tc>
@@ -13554,7 +13560,7 @@
           <w:rFonts w:ascii="Times New Roman" w:hAnsi="Times New Roman" w:cs="Times New Roman"/>
         </w:rPr>
         <w:pict w14:anchorId="6026C70F">
-          <v:rect id="_x0000_i1155" style="width:0;height:.75pt" o:hralign="center" o:hrstd="t" o:hr="t" fillcolor="#a0a0a0" stroked="f"/>
+          <v:rect id="_x0000_i1025" style="width:0;height:.75pt" o:hralign="center" o:hrstd="t" o:hr="t" fillcolor="#a0a0a0" stroked="f"/>
         </w:pict>
       </w:r>
     </w:p>
@@ -22270,6 +22276,7 @@
   <w:style w:type="character" w:default="1" w:styleId="DefaultParagraphFont">
     <w:name w:val="Default Paragraph Font"/>
     <w:uiPriority w:val="1"/>
+    <w:semiHidden/>
     <w:unhideWhenUsed/>
   </w:style>
   <w:style w:type="table" w:default="1" w:styleId="TableNormal">

</xml_diff>